<commit_message>
Remove student self-registration; enforce English-only credentials; move language toggle on student page
Drops the self-registration/approval flow (signup page, pending status,
approve/reject) along with its DB field and docs. Restricts login and
registration inputs to English characters. Relocates the student
dashboard's language toggle from the sidebar to the top-right of the
main content area.
</commit_message>
<xml_diff>
--- a/docs/TECHNICAL_DOCUMENTATION.docx
+++ b/docs/TECHNICAL_DOCUMENTATION.docx
@@ -76,7 +76,7 @@
           <w:sz w:val="24"/>
           <w:szCs w:val="24"/>
         </w:rPr>
-        <w:t xml:space="preserve">วันที่จัดทำ: 19 กรกฎาคม 2569</w:t>
+        <w:t xml:space="preserve">วันที่จัดทำ: 9 สิงหาคม 2569</w:t>
       </w:r>
     </w:p>
     <w:p>
@@ -12796,7 +12796,7 @@
           <w:sz w:val="24"/>
           <w:szCs w:val="24"/>
         </w:rPr>
-        <w:t xml:space="preserve">จัดทำเมื่อ: 19 กรกฎาคม 2569</w:t>
+        <w:t xml:space="preserve">จัดทำเมื่อ: 9 สิงหาคม 2569</w:t>
       </w:r>
     </w:p>
     <w:p>

</xml_diff>